<commit_message>
Finalize submissions with refinings
</commit_message>
<xml_diff>
--- a/Thesis/FrontBackmatter/Erklaerung_zur_Abschlussarbeit_Vorlage-fuer_digitale_Abgabe.docx
+++ b/Thesis/FrontBackmatter/Erklaerung_zur_Abschlussarbeit_Vorlage-fuer_digitale_Abgabe.docx
@@ -1,9 +1,11 @@
 
 <file path=word/document.xml><?xml version="1.0" encoding="utf-8"?>
-<w:document xmlns:wpc="http://schemas.microsoft.com/office/word/2010/wordprocessingCanvas" xmlns:cx="http://schemas.microsoft.com/office/drawing/2014/chartex" xmlns:cx1="http://schemas.microsoft.com/office/drawing/2015/9/8/chartex" xmlns:mc="http://schemas.openxmlformats.org/markup-compatibility/2006" xmlns:o="urn:schemas-microsoft-com:office:office" xmlns:r="http://schemas.openxmlformats.org/officeDocument/2006/relationships" xmlns:m="http://schemas.openxmlformats.org/officeDocument/2006/math" xmlns:v="urn:schemas-microsoft-com:vml" xmlns:wp14="http://schemas.microsoft.com/office/word/2010/wordprocessingDrawing" xmlns:wp="http://schemas.openxmlformats.org/drawingml/2006/wordprocessingDrawing" xmlns:w10="urn:schemas-microsoft-com:office:word" xmlns:w="http://schemas.openxmlformats.org/wordprocessingml/2006/main" xmlns:w14="http://schemas.microsoft.com/office/word/2010/wordml" xmlns:w15="http://schemas.microsoft.com/office/word/2012/wordml" xmlns:w16se="http://schemas.microsoft.com/office/word/2015/wordml/symex" xmlns:wpg="http://schemas.microsoft.com/office/word/2010/wordprocessingGroup" xmlns:wpi="http://schemas.microsoft.com/office/word/2010/wordprocessingInk" xmlns:wne="http://schemas.microsoft.com/office/word/2006/wordml" xmlns:wps="http://schemas.microsoft.com/office/word/2010/wordprocessingShape" mc:Ignorable="w14 w15 w16se wp14">
+<w:document xmlns:wpc="http://schemas.microsoft.com/office/word/2010/wordprocessingCanvas" xmlns:cx="http://schemas.microsoft.com/office/drawing/2014/chartex" xmlns:cx1="http://schemas.microsoft.com/office/drawing/2015/9/8/chartex" xmlns:cx2="http://schemas.microsoft.com/office/drawing/2015/10/21/chartex" xmlns:cx3="http://schemas.microsoft.com/office/drawing/2016/5/9/chartex" xmlns:cx4="http://schemas.microsoft.com/office/drawing/2016/5/10/chartex" xmlns:cx5="http://schemas.microsoft.com/office/drawing/2016/5/11/chartex" xmlns:cx6="http://schemas.microsoft.com/office/drawing/2016/5/12/chartex" xmlns:cx7="http://schemas.microsoft.com/office/drawing/2016/5/13/chartex" xmlns:cx8="http://schemas.microsoft.com/office/drawing/2016/5/14/chartex" xmlns:mc="http://schemas.openxmlformats.org/markup-compatibility/2006" xmlns:aink="http://schemas.microsoft.com/office/drawing/2016/ink" xmlns:am3d="http://schemas.microsoft.com/office/drawing/2017/model3d" xmlns:o="urn:schemas-microsoft-com:office:office" xmlns:oel="http://schemas.microsoft.com/office/2019/extlst" xmlns:r="http://schemas.openxmlformats.org/officeDocument/2006/relationships" xmlns:m="http://schemas.openxmlformats.org/officeDocument/2006/math" xmlns:v="urn:schemas-microsoft-com:vml" xmlns:wp14="http://schemas.microsoft.com/office/word/2010/wordprocessingDrawing" xmlns:wp="http://schemas.openxmlformats.org/drawingml/2006/wordprocessingDrawing" xmlns:w10="urn:schemas-microsoft-com:office:word" xmlns:w="http://schemas.openxmlformats.org/wordprocessingml/2006/main" xmlns:w14="http://schemas.microsoft.com/office/word/2010/wordml" xmlns:w15="http://schemas.microsoft.com/office/word/2012/wordml" xmlns:w16cex="http://schemas.microsoft.com/office/word/2018/wordml/cex" xmlns:w16cid="http://schemas.microsoft.com/office/word/2016/wordml/cid" xmlns:w16="http://schemas.microsoft.com/office/word/2018/wordml" xmlns:w16du="http://schemas.microsoft.com/office/word/2023/wordml/word16du" xmlns:w16sdtdh="http://schemas.microsoft.com/office/word/2020/wordml/sdtdatahash" xmlns:w16se="http://schemas.microsoft.com/office/word/2015/wordml/symex" xmlns:wpg="http://schemas.microsoft.com/office/word/2010/wordprocessingGroup" xmlns:wpi="http://schemas.microsoft.com/office/word/2010/wordprocessingInk" xmlns:wne="http://schemas.microsoft.com/office/word/2006/wordml" xmlns:wps="http://schemas.microsoft.com/office/word/2010/wordprocessingShape" mc:Ignorable="w14 w15 w16se w16cid w16 w16cex w16sdtdh wp14">
   <w:body>
     <w:p>
       <w:pPr>
+        <w:spacing w:line="360" w:lineRule="auto"/>
+        <w:jc w:val="both"/>
         <w:rPr>
           <w:b/>
         </w:rPr>
@@ -11,6 +13,8 @@
     </w:p>
     <w:p>
       <w:pPr>
+        <w:spacing w:line="360" w:lineRule="auto"/>
+        <w:jc w:val="both"/>
         <w:rPr>
           <w:b/>
         </w:rPr>
@@ -41,6 +45,10 @@
       </w:r>
     </w:p>
     <w:p>
+      <w:pPr>
+        <w:spacing w:line="360" w:lineRule="auto"/>
+        <w:jc w:val="both"/>
+      </w:pPr>
       <w:r>
         <w:t xml:space="preserve">Hiermit versichere ich, </w:t>
       </w:r>
@@ -49,7 +57,7 @@
           <w:i/>
           <w:u w:val="single"/>
         </w:rPr>
-        <w:t>Vorname Name</w:t>
+        <w:t>Ritesh Shrestha</w:t>
       </w:r>
       <w:r>
         <w:t xml:space="preserve">, die vorliegende Master-Thesis / Bachelor-Thesis </w:t>
@@ -71,13 +79,12 @@
       </w:r>
     </w:p>
     <w:p>
+      <w:pPr>
+        <w:spacing w:line="360" w:lineRule="auto"/>
+        <w:jc w:val="both"/>
+      </w:pPr>
       <w:r>
         <w:t>Mir ist bekannt, dass im Falle eines Plagiats (§38 Abs.2 APB) ein Täuschungsversuch vorliegt, der dazu führt, dass die Arbeit mit 5,0 bewertet und damit ein Prüfungsversuch verbraucht wird. Abschlussarbeiten dürfen nur einmal wiederholt werden.</w:t>
-      </w:r>
-    </w:p>
-    <w:p>
-      <w:r>
-        <w:t>Bei einer Thesis des Fachbereichs Architektur entspricht die eingereichte elektronische Fassung dem vorgestellten Modell und den vorgelegten Plänen.</w:t>
       </w:r>
     </w:p>
     <w:p>
@@ -85,48 +92,23 @@
         <w:pBdr>
           <w:bottom w:val="single" w:sz="4" w:space="1" w:color="auto"/>
         </w:pBdr>
+        <w:spacing w:line="360" w:lineRule="auto"/>
+        <w:jc w:val="both"/>
       </w:pPr>
     </w:p>
     <w:p>
       <w:pPr>
-        <w:spacing w:after="0"/>
+        <w:spacing w:after="0" w:line="360" w:lineRule="auto"/>
+        <w:jc w:val="both"/>
+        <w:rPr>
+          <w:lang w:val="en-US"/>
+        </w:rPr>
       </w:pPr>
     </w:p>
     <w:p>
       <w:pPr>
-        <w:rPr>
-          <w:rStyle w:val="hps"/>
-          <w:b/>
-          <w:lang w:val="en"/>
-        </w:rPr>
-      </w:pPr>
-      <w:r>
-        <w:rPr>
-          <w:rStyle w:val="hps"/>
-          <w:b/>
-          <w:lang w:val="en"/>
-        </w:rPr>
-        <w:t xml:space="preserve">English translation </w:t>
-      </w:r>
-      <w:r>
-        <w:rPr>
-          <w:rStyle w:val="hps"/>
-          <w:b/>
-          <w:lang w:val="en"/>
-        </w:rPr>
-        <w:t>for information purposes only:</w:t>
-      </w:r>
-    </w:p>
-    <w:p>
-      <w:pPr>
-        <w:spacing w:after="0"/>
-        <w:rPr>
-          <w:lang w:val="en-US"/>
-        </w:rPr>
-      </w:pPr>
-    </w:p>
-    <w:p>
-      <w:pPr>
+        <w:spacing w:line="360" w:lineRule="auto"/>
+        <w:jc w:val="both"/>
         <w:rPr>
           <w:rStyle w:val="hps"/>
           <w:b/>
@@ -155,6 +137,8 @@
     </w:p>
     <w:p>
       <w:pPr>
+        <w:spacing w:line="360" w:lineRule="auto"/>
+        <w:jc w:val="both"/>
         <w:rPr>
           <w:rStyle w:val="hps"/>
           <w:lang w:val="en"/>
@@ -189,51 +173,10 @@
       </w:r>
       <w:r>
         <w:rPr>
-          <w:lang w:val="en-US"/>
-        </w:rPr>
-        <w:t>f</w:t>
-      </w:r>
-      <w:r>
-        <w:rPr>
           <w:i/>
           <w:u w:val="single"/>
-          <w:lang w:val="en-US"/>
-        </w:rPr>
-        <w:t xml:space="preserve">irst name </w:t>
-      </w:r>
-      <w:bookmarkStart w:id="0" w:name="_GoBack"/>
-      <w:bookmarkEnd w:id="0"/>
-      <w:r>
-        <w:rPr>
-          <w:i/>
-          <w:u w:val="single"/>
-          <w:lang w:val="en-US"/>
-        </w:rPr>
-        <w:t>last</w:t>
-      </w:r>
-      <w:r>
-        <w:rPr>
-          <w:i/>
-          <w:u w:val="single"/>
-          <w:lang w:val="en-US"/>
-        </w:rPr>
-        <w:t xml:space="preserve"> </w:t>
-      </w:r>
-      <w:r>
-        <w:rPr>
-          <w:i/>
-          <w:u w:val="single"/>
-          <w:lang w:val="en-US"/>
-        </w:rPr>
-        <w:t>n</w:t>
-      </w:r>
-      <w:r>
-        <w:rPr>
-          <w:i/>
-          <w:u w:val="single"/>
-          <w:lang w:val="en-US"/>
-        </w:rPr>
-        <w:t>ame</w:t>
+        </w:rPr>
+        <w:t>Ritesh Shrestha</w:t>
       </w:r>
       <w:r>
         <w:rPr>
@@ -281,7 +224,7 @@
           <w:rStyle w:val="hps"/>
           <w:lang w:val="en"/>
         </w:rPr>
-        <w:t xml:space="preserve">. I did not use any outside support except for the quoted literature and other sources mentioned in the paper. I clearly marked and separately listed all of the literature and all of the other </w:t>
+        <w:t xml:space="preserve">. I did not use any outside support except for the quoted literature and other sources mentioned in the paper. I clearly marked and separately listed </w:t>
       </w:r>
       <w:proofErr w:type="gramStart"/>
       <w:r>
@@ -289,7 +232,7 @@
           <w:rStyle w:val="hps"/>
           <w:lang w:val="en"/>
         </w:rPr>
-        <w:t>sources which</w:t>
+        <w:t>all of</w:t>
       </w:r>
       <w:proofErr w:type="gramEnd"/>
       <w:r>
@@ -297,11 +240,13 @@
           <w:rStyle w:val="hps"/>
           <w:lang w:val="en"/>
         </w:rPr>
-        <w:t xml:space="preserve"> I employed when producing this academic work, either literally or in content. This thesis has not been handed in or published before in the same or similar form.</w:t>
+        <w:t xml:space="preserve"> the literature and all of the other sources which I employed when producing this academic work, either literally or in content. This thesis has not been handed in or published before in the same or similar form.</w:t>
       </w:r>
     </w:p>
     <w:p>
       <w:pPr>
+        <w:spacing w:line="360" w:lineRule="auto"/>
+        <w:jc w:val="both"/>
         <w:rPr>
           <w:lang w:val="en-US"/>
         </w:rPr>
@@ -346,98 +291,55 @@
         <w:rPr>
           <w:lang w:val="en-US"/>
         </w:rPr>
-        <w:t>graded with 5</w:t>
-      </w:r>
-      <w:proofErr w:type="gramStart"/>
+        <w:t xml:space="preserve">graded with 5,0 and </w:t>
+      </w:r>
       <w:r>
         <w:rPr>
           <w:lang w:val="en-US"/>
         </w:rPr>
-        <w:t>,0</w:t>
-      </w:r>
-      <w:proofErr w:type="gramEnd"/>
+        <w:t xml:space="preserve">counted as </w:t>
+      </w:r>
       <w:r>
         <w:rPr>
           <w:lang w:val="en-US"/>
         </w:rPr>
-        <w:t xml:space="preserve"> and </w:t>
+        <w:t xml:space="preserve">one </w:t>
       </w:r>
       <w:r>
         <w:rPr>
           <w:lang w:val="en-US"/>
         </w:rPr>
-        <w:t xml:space="preserve">counted as </w:t>
+        <w:t xml:space="preserve">failed </w:t>
       </w:r>
       <w:r>
         <w:rPr>
           <w:lang w:val="en-US"/>
         </w:rPr>
-        <w:t xml:space="preserve">one </w:t>
+        <w:t xml:space="preserve">examination attempt. The thesis </w:t>
       </w:r>
       <w:r>
         <w:rPr>
           <w:lang w:val="en-US"/>
         </w:rPr>
-        <w:t xml:space="preserve">failed </w:t>
+        <w:t>may</w:t>
       </w:r>
       <w:r>
         <w:rPr>
           <w:lang w:val="en-US"/>
         </w:rPr>
-        <w:t xml:space="preserve">examination attempt. The thesis </w:t>
+        <w:t xml:space="preserve"> only be re</w:t>
       </w:r>
       <w:r>
         <w:rPr>
           <w:lang w:val="en-US"/>
         </w:rPr>
-        <w:t>may</w:t>
+        <w:t>peated</w:t>
       </w:r>
       <w:r>
         <w:rPr>
           <w:lang w:val="en-US"/>
         </w:rPr>
-        <w:t xml:space="preserve"> only be re</w:t>
-      </w:r>
-      <w:r>
-        <w:rPr>
-          <w:lang w:val="en-US"/>
-        </w:rPr>
-        <w:t>peated</w:t>
-      </w:r>
-      <w:r>
-        <w:rPr>
-          <w:lang w:val="en-US"/>
-        </w:rPr>
         <w:t xml:space="preserve"> once.</w:t>
-      </w:r>
-    </w:p>
-    <w:p>
-      <w:pPr>
-        <w:rPr>
-          <w:rStyle w:val="hps"/>
-          <w:lang w:val="en-US"/>
-        </w:rPr>
-      </w:pPr>
-      <w:r>
-        <w:rPr>
-          <w:rStyle w:val="hps"/>
-          <w:lang w:val="en-US"/>
-        </w:rPr>
-        <w:t xml:space="preserve">For </w:t>
-      </w:r>
-      <w:r>
-        <w:rPr>
-          <w:rStyle w:val="hps"/>
-          <w:lang w:val="en-US"/>
-        </w:rPr>
-        <w:t>a</w:t>
-      </w:r>
-      <w:r>
-        <w:rPr>
-          <w:rStyle w:val="hps"/>
-          <w:lang w:val="en-US"/>
-        </w:rPr>
-        <w:t xml:space="preserve"> thesis of the Department of Architecture, the submitted electronic version corresponds to the presented model and the submitted architectural plans.</w:t>
       </w:r>
     </w:p>
     <w:p>
@@ -445,6 +347,8 @@
         <w:pBdr>
           <w:bottom w:val="single" w:sz="4" w:space="1" w:color="auto"/>
         </w:pBdr>
+        <w:spacing w:line="360" w:lineRule="auto"/>
+        <w:jc w:val="both"/>
         <w:rPr>
           <w:lang w:val="en-US"/>
         </w:rPr>
@@ -452,7 +356,8 @@
     </w:p>
     <w:p>
       <w:pPr>
-        <w:spacing w:after="360"/>
+        <w:spacing w:after="360" w:line="360" w:lineRule="auto"/>
+        <w:jc w:val="both"/>
         <w:rPr>
           <w:lang w:val="en-US"/>
         </w:rPr>
@@ -460,7 +365,17 @@
     </w:p>
     <w:p>
       <w:pPr>
-        <w:spacing w:after="360"/>
+        <w:spacing w:after="360" w:line="360" w:lineRule="auto"/>
+        <w:jc w:val="both"/>
+        <w:rPr>
+          <w:lang w:val="en-US"/>
+        </w:rPr>
+      </w:pPr>
+    </w:p>
+    <w:p>
+      <w:pPr>
+        <w:spacing w:after="360" w:line="360" w:lineRule="auto"/>
+        <w:jc w:val="both"/>
       </w:pPr>
       <w:r>
         <w:t xml:space="preserve">Datum </w:t>
@@ -502,6 +417,8 @@
         <w:tabs>
           <w:tab w:val="left" w:pos="3544"/>
         </w:tabs>
+        <w:spacing w:line="360" w:lineRule="auto"/>
+        <w:jc w:val="both"/>
         <w:rPr>
           <w:rStyle w:val="hps"/>
         </w:rPr>
@@ -525,8 +442,6 @@
       <w:headerReference w:type="default" r:id="rId11"/>
       <w:footerReference w:type="even" r:id="rId12"/>
       <w:footerReference w:type="default" r:id="rId13"/>
-      <w:headerReference w:type="first" r:id="rId14"/>
-      <w:footerReference w:type="first" r:id="rId15"/>
       <w:type w:val="continuous"/>
       <w:pgSz w:w="11906" w:h="16838" w:code="9"/>
       <w:pgMar w:top="1418" w:right="1134" w:bottom="1304" w:left="1701" w:header="709" w:footer="567" w:gutter="0"/>
@@ -539,7 +454,7 @@
 </file>
 
 <file path=word/endnotes.xml><?xml version="1.0" encoding="utf-8"?>
-<w:endnotes xmlns:wpc="http://schemas.microsoft.com/office/word/2010/wordprocessingCanvas" xmlns:cx="http://schemas.microsoft.com/office/drawing/2014/chartex" xmlns:cx1="http://schemas.microsoft.com/office/drawing/2015/9/8/chartex" xmlns:mc="http://schemas.openxmlformats.org/markup-compatibility/2006" xmlns:o="urn:schemas-microsoft-com:office:office" xmlns:r="http://schemas.openxmlformats.org/officeDocument/2006/relationships" xmlns:m="http://schemas.openxmlformats.org/officeDocument/2006/math" xmlns:v="urn:schemas-microsoft-com:vml" xmlns:wp14="http://schemas.microsoft.com/office/word/2010/wordprocessingDrawing" xmlns:wp="http://schemas.openxmlformats.org/drawingml/2006/wordprocessingDrawing" xmlns:w10="urn:schemas-microsoft-com:office:word" xmlns:w="http://schemas.openxmlformats.org/wordprocessingml/2006/main" xmlns:w14="http://schemas.microsoft.com/office/word/2010/wordml" xmlns:w15="http://schemas.microsoft.com/office/word/2012/wordml" xmlns:w16se="http://schemas.microsoft.com/office/word/2015/wordml/symex" xmlns:wpg="http://schemas.microsoft.com/office/word/2010/wordprocessingGroup" xmlns:wpi="http://schemas.microsoft.com/office/word/2010/wordprocessingInk" xmlns:wne="http://schemas.microsoft.com/office/word/2006/wordml" xmlns:wps="http://schemas.microsoft.com/office/word/2010/wordprocessingShape" mc:Ignorable="w14 w15 w16se wp14">
+<w:endnotes xmlns:wpc="http://schemas.microsoft.com/office/word/2010/wordprocessingCanvas" xmlns:cx="http://schemas.microsoft.com/office/drawing/2014/chartex" xmlns:cx1="http://schemas.microsoft.com/office/drawing/2015/9/8/chartex" xmlns:cx2="http://schemas.microsoft.com/office/drawing/2015/10/21/chartex" xmlns:cx3="http://schemas.microsoft.com/office/drawing/2016/5/9/chartex" xmlns:cx4="http://schemas.microsoft.com/office/drawing/2016/5/10/chartex" xmlns:cx5="http://schemas.microsoft.com/office/drawing/2016/5/11/chartex" xmlns:cx6="http://schemas.microsoft.com/office/drawing/2016/5/12/chartex" xmlns:cx7="http://schemas.microsoft.com/office/drawing/2016/5/13/chartex" xmlns:cx8="http://schemas.microsoft.com/office/drawing/2016/5/14/chartex" xmlns:mc="http://schemas.openxmlformats.org/markup-compatibility/2006" xmlns:aink="http://schemas.microsoft.com/office/drawing/2016/ink" xmlns:am3d="http://schemas.microsoft.com/office/drawing/2017/model3d" xmlns:o="urn:schemas-microsoft-com:office:office" xmlns:oel="http://schemas.microsoft.com/office/2019/extlst" xmlns:r="http://schemas.openxmlformats.org/officeDocument/2006/relationships" xmlns:m="http://schemas.openxmlformats.org/officeDocument/2006/math" xmlns:v="urn:schemas-microsoft-com:vml" xmlns:wp14="http://schemas.microsoft.com/office/word/2010/wordprocessingDrawing" xmlns:wp="http://schemas.openxmlformats.org/drawingml/2006/wordprocessingDrawing" xmlns:w10="urn:schemas-microsoft-com:office:word" xmlns:w="http://schemas.openxmlformats.org/wordprocessingml/2006/main" xmlns:w14="http://schemas.microsoft.com/office/word/2010/wordml" xmlns:w15="http://schemas.microsoft.com/office/word/2012/wordml" xmlns:w16cex="http://schemas.microsoft.com/office/word/2018/wordml/cex" xmlns:w16cid="http://schemas.microsoft.com/office/word/2016/wordml/cid" xmlns:w16="http://schemas.microsoft.com/office/word/2018/wordml" xmlns:w16du="http://schemas.microsoft.com/office/word/2023/wordml/word16du" xmlns:w16sdtdh="http://schemas.microsoft.com/office/word/2020/wordml/sdtdatahash" xmlns:w16se="http://schemas.microsoft.com/office/word/2015/wordml/symex" xmlns:wpg="http://schemas.microsoft.com/office/word/2010/wordprocessingGroup" xmlns:wpi="http://schemas.microsoft.com/office/word/2010/wordprocessingInk" xmlns:wne="http://schemas.microsoft.com/office/word/2006/wordml" xmlns:wps="http://schemas.microsoft.com/office/word/2010/wordprocessingShape" mc:Ignorable="w14 w15 w16se w16cid w16 w16cex w16sdtdh wp14">
   <w:endnote w:type="separator" w:id="-1">
     <w:p>
       <w:pPr>
@@ -564,10 +479,10 @@
 </file>
 
 <file path=word/footer1.xml><?xml version="1.0" encoding="utf-8"?>
-<w:ftr xmlns:wpc="http://schemas.microsoft.com/office/word/2010/wordprocessingCanvas" xmlns:cx="http://schemas.microsoft.com/office/drawing/2014/chartex" xmlns:cx1="http://schemas.microsoft.com/office/drawing/2015/9/8/chartex" xmlns:mc="http://schemas.openxmlformats.org/markup-compatibility/2006" xmlns:o="urn:schemas-microsoft-com:office:office" xmlns:r="http://schemas.openxmlformats.org/officeDocument/2006/relationships" xmlns:m="http://schemas.openxmlformats.org/officeDocument/2006/math" xmlns:v="urn:schemas-microsoft-com:vml" xmlns:wp14="http://schemas.microsoft.com/office/word/2010/wordprocessingDrawing" xmlns:wp="http://schemas.openxmlformats.org/drawingml/2006/wordprocessingDrawing" xmlns:w10="urn:schemas-microsoft-com:office:word" xmlns:w="http://schemas.openxmlformats.org/wordprocessingml/2006/main" xmlns:w14="http://schemas.microsoft.com/office/word/2010/wordml" xmlns:w15="http://schemas.microsoft.com/office/word/2012/wordml" xmlns:w16se="http://schemas.microsoft.com/office/word/2015/wordml/symex" xmlns:wpg="http://schemas.microsoft.com/office/word/2010/wordprocessingGroup" xmlns:wpi="http://schemas.microsoft.com/office/word/2010/wordprocessingInk" xmlns:wne="http://schemas.microsoft.com/office/word/2006/wordml" xmlns:wps="http://schemas.microsoft.com/office/word/2010/wordprocessingShape" mc:Ignorable="w14 w15 w16se wp14">
+<w:ftr xmlns:wpc="http://schemas.microsoft.com/office/word/2010/wordprocessingCanvas" xmlns:cx="http://schemas.microsoft.com/office/drawing/2014/chartex" xmlns:cx1="http://schemas.microsoft.com/office/drawing/2015/9/8/chartex" xmlns:cx2="http://schemas.microsoft.com/office/drawing/2015/10/21/chartex" xmlns:cx3="http://schemas.microsoft.com/office/drawing/2016/5/9/chartex" xmlns:cx4="http://schemas.microsoft.com/office/drawing/2016/5/10/chartex" xmlns:cx5="http://schemas.microsoft.com/office/drawing/2016/5/11/chartex" xmlns:cx6="http://schemas.microsoft.com/office/drawing/2016/5/12/chartex" xmlns:cx7="http://schemas.microsoft.com/office/drawing/2016/5/13/chartex" xmlns:cx8="http://schemas.microsoft.com/office/drawing/2016/5/14/chartex" xmlns:mc="http://schemas.openxmlformats.org/markup-compatibility/2006" xmlns:aink="http://schemas.microsoft.com/office/drawing/2016/ink" xmlns:am3d="http://schemas.microsoft.com/office/drawing/2017/model3d" xmlns:o="urn:schemas-microsoft-com:office:office" xmlns:oel="http://schemas.microsoft.com/office/2019/extlst" xmlns:r="http://schemas.openxmlformats.org/officeDocument/2006/relationships" xmlns:m="http://schemas.openxmlformats.org/officeDocument/2006/math" xmlns:v="urn:schemas-microsoft-com:vml" xmlns:wp14="http://schemas.microsoft.com/office/word/2010/wordprocessingDrawing" xmlns:wp="http://schemas.openxmlformats.org/drawingml/2006/wordprocessingDrawing" xmlns:w10="urn:schemas-microsoft-com:office:word" xmlns:w="http://schemas.openxmlformats.org/wordprocessingml/2006/main" xmlns:w14="http://schemas.microsoft.com/office/word/2010/wordml" xmlns:w15="http://schemas.microsoft.com/office/word/2012/wordml" xmlns:w16cex="http://schemas.microsoft.com/office/word/2018/wordml/cex" xmlns:w16cid="http://schemas.microsoft.com/office/word/2016/wordml/cid" xmlns:w16="http://schemas.microsoft.com/office/word/2018/wordml" xmlns:w16du="http://schemas.microsoft.com/office/word/2023/wordml/word16du" xmlns:w16sdtdh="http://schemas.microsoft.com/office/word/2020/wordml/sdtdatahash" xmlns:w16se="http://schemas.microsoft.com/office/word/2015/wordml/symex" xmlns:wpg="http://schemas.microsoft.com/office/word/2010/wordprocessingGroup" xmlns:wpi="http://schemas.microsoft.com/office/word/2010/wordprocessingInk" xmlns:wne="http://schemas.microsoft.com/office/word/2006/wordml" xmlns:wps="http://schemas.microsoft.com/office/word/2010/wordprocessingShape" mc:Ignorable="w14 w15 w16se w16cid w16 w16cex w16sdtdh wp14">
   <w:p>
     <w:pPr>
-      <w:pStyle w:val="Fuzeile"/>
+      <w:pStyle w:val="Footer"/>
       <w:tabs>
         <w:tab w:val="clear" w:pos="4820"/>
         <w:tab w:val="clear" w:pos="9072"/>
@@ -700,178 +615,22 @@
 </file>
 
 <file path=word/footer2.xml><?xml version="1.0" encoding="utf-8"?>
-<w:ftr xmlns:wpc="http://schemas.microsoft.com/office/word/2010/wordprocessingCanvas" xmlns:cx="http://schemas.microsoft.com/office/drawing/2014/chartex" xmlns:cx1="http://schemas.microsoft.com/office/drawing/2015/9/8/chartex" xmlns:mc="http://schemas.openxmlformats.org/markup-compatibility/2006" xmlns:o="urn:schemas-microsoft-com:office:office" xmlns:r="http://schemas.openxmlformats.org/officeDocument/2006/relationships" xmlns:m="http://schemas.openxmlformats.org/officeDocument/2006/math" xmlns:v="urn:schemas-microsoft-com:vml" xmlns:wp14="http://schemas.microsoft.com/office/word/2010/wordprocessingDrawing" xmlns:wp="http://schemas.openxmlformats.org/drawingml/2006/wordprocessingDrawing" xmlns:w10="urn:schemas-microsoft-com:office:word" xmlns:w="http://schemas.openxmlformats.org/wordprocessingml/2006/main" xmlns:w14="http://schemas.microsoft.com/office/word/2010/wordml" xmlns:w15="http://schemas.microsoft.com/office/word/2012/wordml" xmlns:w16se="http://schemas.microsoft.com/office/word/2015/wordml/symex" xmlns:wpg="http://schemas.microsoft.com/office/word/2010/wordprocessingGroup" xmlns:wpi="http://schemas.microsoft.com/office/word/2010/wordprocessingInk" xmlns:wne="http://schemas.microsoft.com/office/word/2006/wordml" xmlns:wps="http://schemas.microsoft.com/office/word/2010/wordprocessingShape" mc:Ignorable="w14 w15 w16se wp14">
+<w:ftr xmlns:wpc="http://schemas.microsoft.com/office/word/2010/wordprocessingCanvas" xmlns:cx="http://schemas.microsoft.com/office/drawing/2014/chartex" xmlns:cx1="http://schemas.microsoft.com/office/drawing/2015/9/8/chartex" xmlns:cx2="http://schemas.microsoft.com/office/drawing/2015/10/21/chartex" xmlns:cx3="http://schemas.microsoft.com/office/drawing/2016/5/9/chartex" xmlns:cx4="http://schemas.microsoft.com/office/drawing/2016/5/10/chartex" xmlns:cx5="http://schemas.microsoft.com/office/drawing/2016/5/11/chartex" xmlns:cx6="http://schemas.microsoft.com/office/drawing/2016/5/12/chartex" xmlns:cx7="http://schemas.microsoft.com/office/drawing/2016/5/13/chartex" xmlns:cx8="http://schemas.microsoft.com/office/drawing/2016/5/14/chartex" xmlns:mc="http://schemas.openxmlformats.org/markup-compatibility/2006" xmlns:aink="http://schemas.microsoft.com/office/drawing/2016/ink" xmlns:am3d="http://schemas.microsoft.com/office/drawing/2017/model3d" xmlns:o="urn:schemas-microsoft-com:office:office" xmlns:oel="http://schemas.microsoft.com/office/2019/extlst" xmlns:r="http://schemas.openxmlformats.org/officeDocument/2006/relationships" xmlns:m="http://schemas.openxmlformats.org/officeDocument/2006/math" xmlns:v="urn:schemas-microsoft-com:vml" xmlns:wp14="http://schemas.microsoft.com/office/word/2010/wordprocessingDrawing" xmlns:wp="http://schemas.openxmlformats.org/drawingml/2006/wordprocessingDrawing" xmlns:w10="urn:schemas-microsoft-com:office:word" xmlns:w="http://schemas.openxmlformats.org/wordprocessingml/2006/main" xmlns:w14="http://schemas.microsoft.com/office/word/2010/wordml" xmlns:w15="http://schemas.microsoft.com/office/word/2012/wordml" xmlns:w16cex="http://schemas.microsoft.com/office/word/2018/wordml/cex" xmlns:w16cid="http://schemas.microsoft.com/office/word/2016/wordml/cid" xmlns:w16="http://schemas.microsoft.com/office/word/2018/wordml" xmlns:w16du="http://schemas.microsoft.com/office/word/2023/wordml/word16du" xmlns:w16sdtdh="http://schemas.microsoft.com/office/word/2020/wordml/sdtdatahash" xmlns:w16se="http://schemas.microsoft.com/office/word/2015/wordml/symex" xmlns:wpg="http://schemas.microsoft.com/office/word/2010/wordprocessingGroup" xmlns:wpi="http://schemas.microsoft.com/office/word/2010/wordprocessingInk" xmlns:wne="http://schemas.microsoft.com/office/word/2006/wordml" xmlns:wps="http://schemas.microsoft.com/office/word/2010/wordprocessingShape" mc:Ignorable="w14 w15 w16se w16cid w16 w16cex w16sdtdh wp14">
   <w:p>
     <w:pPr>
-      <w:pStyle w:val="Fuzeile"/>
-      <w:tabs>
-        <w:tab w:val="clear" w:pos="4820"/>
-        <w:tab w:val="clear" w:pos="9072"/>
-        <w:tab w:val="left" w:pos="3544"/>
-        <w:tab w:val="right" w:pos="9071"/>
-      </w:tabs>
-      <w:rPr>
-        <w:sz w:val="16"/>
-        <w:szCs w:val="16"/>
-      </w:rPr>
+      <w:pStyle w:val="Footer"/>
     </w:pPr>
-    <w:r>
-      <w:rPr>
-        <w:sz w:val="16"/>
-        <w:szCs w:val="16"/>
-      </w:rPr>
-      <w:t>Vorlage „Erklärung zur Abschlussarbeit“</w:t>
-    </w:r>
-    <w:r>
-      <w:rPr>
-        <w:sz w:val="16"/>
-        <w:szCs w:val="16"/>
-      </w:rPr>
-      <w:tab/>
-    </w:r>
-    <w:r>
-      <w:rPr>
-        <w:sz w:val="16"/>
-        <w:szCs w:val="16"/>
-      </w:rPr>
-      <w:t>Dezernat II – Studium und Lehre, Hochschulrecht</w:t>
-    </w:r>
-    <w:r>
-      <w:rPr>
-        <w:sz w:val="16"/>
-        <w:szCs w:val="16"/>
-      </w:rPr>
-      <w:tab/>
-    </w:r>
-    <w:r>
-      <w:rPr>
-        <w:noProof/>
-        <w:sz w:val="16"/>
-        <w:szCs w:val="16"/>
-      </w:rPr>
-      <mc:AlternateContent>
-        <mc:Choice Requires="wps">
-          <w:drawing>
-            <wp:anchor distT="4294967295" distB="4294967295" distL="114300" distR="114300" simplePos="0" relativeHeight="251654144" behindDoc="1" locked="1" layoutInCell="1" allowOverlap="1" wp14:anchorId="4EC4F674" wp14:editId="4EC4F675">
-              <wp:simplePos x="0" y="0"/>
-              <wp:positionH relativeFrom="page">
-                <wp:posOffset>1080135</wp:posOffset>
-              </wp:positionH>
-              <wp:positionV relativeFrom="page">
-                <wp:posOffset>10045064</wp:posOffset>
-              </wp:positionV>
-              <wp:extent cx="5760085" cy="0"/>
-              <wp:effectExtent l="0" t="0" r="12065" b="19050"/>
-              <wp:wrapNone/>
-              <wp:docPr id="1" name="Line 27"/>
-              <wp:cNvGraphicFramePr>
-                <a:graphicFrameLocks xmlns:a="http://schemas.openxmlformats.org/drawingml/2006/main"/>
-              </wp:cNvGraphicFramePr>
-              <a:graphic xmlns:a="http://schemas.openxmlformats.org/drawingml/2006/main">
-                <a:graphicData uri="http://schemas.microsoft.com/office/word/2010/wordprocessingShape">
-                  <wps:wsp>
-                    <wps:cNvCnPr>
-                      <a:cxnSpLocks noChangeShapeType="1"/>
-                    </wps:cNvCnPr>
-                    <wps:spPr bwMode="auto">
-                      <a:xfrm>
-                        <a:off x="0" y="0"/>
-                        <a:ext cx="5760085" cy="0"/>
-                      </a:xfrm>
-                      <a:prstGeom prst="line">
-                        <a:avLst/>
-                      </a:prstGeom>
-                      <a:noFill/>
-                      <a:ln w="6350">
-                        <a:solidFill>
-                          <a:srgbClr val="000000"/>
-                        </a:solidFill>
-                        <a:round/>
-                        <a:headEnd/>
-                        <a:tailEnd/>
-                      </a:ln>
-                      <a:extLst>
-                        <a:ext uri="{909E8E84-426E-40DD-AFC4-6F175D3DCCD1}">
-                          <a14:hiddenFill xmlns:a14="http://schemas.microsoft.com/office/drawing/2010/main">
-                            <a:noFill/>
-                          </a14:hiddenFill>
-                        </a:ext>
-                      </a:extLst>
-                    </wps:spPr>
-                    <wps:bodyPr/>
-                  </wps:wsp>
-                </a:graphicData>
-              </a:graphic>
-              <wp14:sizeRelH relativeFrom="page">
-                <wp14:pctWidth>0</wp14:pctWidth>
-              </wp14:sizeRelH>
-              <wp14:sizeRelV relativeFrom="page">
-                <wp14:pctHeight>0</wp14:pctHeight>
-              </wp14:sizeRelV>
-            </wp:anchor>
-          </w:drawing>
-        </mc:Choice>
-        <mc:Fallback>
-          <w:pict>
-            <v:line w14:anchorId="11ED5800" id="Line 27" o:spid="_x0000_s1026" style="position:absolute;z-index:-251662336;visibility:visible;mso-wrap-style:square;mso-width-percent:0;mso-height-percent:0;mso-wrap-distance-left:9pt;mso-wrap-distance-top:-3e-5mm;mso-wrap-distance-right:9pt;mso-wrap-distance-bottom:-3e-5mm;mso-position-horizontal:absolute;mso-position-horizontal-relative:page;mso-position-vertical:absolute;mso-position-vertical-relative:page;mso-width-percent:0;mso-height-percent:0;mso-width-relative:page;mso-height-relative:page" from="85.05pt,790.95pt" to="538.6pt,790.95pt" o:gfxdata="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" strokeweight=".5pt">
-              <w10:wrap anchorx="page" anchory="page"/>
-              <w10:anchorlock/>
-            </v:line>
-          </w:pict>
-        </mc:Fallback>
-      </mc:AlternateContent>
-    </w:r>
-    <w:r>
-      <w:rPr>
-        <w:sz w:val="16"/>
-        <w:szCs w:val="16"/>
-      </w:rPr>
-      <w:t xml:space="preserve">Stand: </w:t>
-    </w:r>
-    <w:r>
-      <w:rPr>
-        <w:sz w:val="16"/>
-        <w:szCs w:val="16"/>
-      </w:rPr>
-      <w:t>20.0</w:t>
-    </w:r>
-    <w:r>
-      <w:rPr>
-        <w:sz w:val="16"/>
-        <w:szCs w:val="16"/>
-      </w:rPr>
-      <w:t>3</w:t>
-    </w:r>
-    <w:r>
-      <w:rPr>
-        <w:sz w:val="16"/>
-        <w:szCs w:val="16"/>
-      </w:rPr>
-      <w:t>.20</w:t>
-    </w:r>
-    <w:r>
-      <w:rPr>
-        <w:sz w:val="16"/>
-        <w:szCs w:val="16"/>
-      </w:rPr>
-      <w:t>20</w:t>
-    </w:r>
   </w:p>
-</w:ftr>
-</file>
-
-<file path=word/footer3.xml><?xml version="1.0" encoding="utf-8"?>
-<w:ftr xmlns:wpc="http://schemas.microsoft.com/office/word/2010/wordprocessingCanvas" xmlns:cx="http://schemas.microsoft.com/office/drawing/2014/chartex" xmlns:cx1="http://schemas.microsoft.com/office/drawing/2015/9/8/chartex" xmlns:mc="http://schemas.openxmlformats.org/markup-compatibility/2006" xmlns:o="urn:schemas-microsoft-com:office:office" xmlns:r="http://schemas.openxmlformats.org/officeDocument/2006/relationships" xmlns:m="http://schemas.openxmlformats.org/officeDocument/2006/math" xmlns:v="urn:schemas-microsoft-com:vml" xmlns:wp14="http://schemas.microsoft.com/office/word/2010/wordprocessingDrawing" xmlns:wp="http://schemas.openxmlformats.org/drawingml/2006/wordprocessingDrawing" xmlns:w10="urn:schemas-microsoft-com:office:word" xmlns:w="http://schemas.openxmlformats.org/wordprocessingml/2006/main" xmlns:w14="http://schemas.microsoft.com/office/word/2010/wordml" xmlns:w15="http://schemas.microsoft.com/office/word/2012/wordml" xmlns:w16se="http://schemas.microsoft.com/office/word/2015/wordml/symex" xmlns:wpg="http://schemas.microsoft.com/office/word/2010/wordprocessingGroup" xmlns:wpi="http://schemas.microsoft.com/office/word/2010/wordprocessingInk" xmlns:wne="http://schemas.microsoft.com/office/word/2006/wordml" xmlns:wps="http://schemas.microsoft.com/office/word/2010/wordprocessingShape" mc:Ignorable="w14 w15 w16se wp14">
   <w:p>
     <w:pPr>
-      <w:pStyle w:val="Fuzeile"/>
+      <w:jc w:val="center"/>
     </w:pPr>
   </w:p>
 </w:ftr>
 </file>
 
 <file path=word/footnotes.xml><?xml version="1.0" encoding="utf-8"?>
-<w:footnotes xmlns:wpc="http://schemas.microsoft.com/office/word/2010/wordprocessingCanvas" xmlns:cx="http://schemas.microsoft.com/office/drawing/2014/chartex" xmlns:cx1="http://schemas.microsoft.com/office/drawing/2015/9/8/chartex" xmlns:mc="http://schemas.openxmlformats.org/markup-compatibility/2006" xmlns:o="urn:schemas-microsoft-com:office:office" xmlns:r="http://schemas.openxmlformats.org/officeDocument/2006/relationships" xmlns:m="http://schemas.openxmlformats.org/officeDocument/2006/math" xmlns:v="urn:schemas-microsoft-com:vml" xmlns:wp14="http://schemas.microsoft.com/office/word/2010/wordprocessingDrawing" xmlns:wp="http://schemas.openxmlformats.org/drawingml/2006/wordprocessingDrawing" xmlns:w10="urn:schemas-microsoft-com:office:word" xmlns:w="http://schemas.openxmlformats.org/wordprocessingml/2006/main" xmlns:w14="http://schemas.microsoft.com/office/word/2010/wordml" xmlns:w15="http://schemas.microsoft.com/office/word/2012/wordml" xmlns:w16se="http://schemas.microsoft.com/office/word/2015/wordml/symex" xmlns:wpg="http://schemas.microsoft.com/office/word/2010/wordprocessingGroup" xmlns:wpi="http://schemas.microsoft.com/office/word/2010/wordprocessingInk" xmlns:wne="http://schemas.microsoft.com/office/word/2006/wordml" xmlns:wps="http://schemas.microsoft.com/office/word/2010/wordprocessingShape" mc:Ignorable="w14 w15 w16se wp14">
+<w:footnotes xmlns:wpc="http://schemas.microsoft.com/office/word/2010/wordprocessingCanvas" xmlns:cx="http://schemas.microsoft.com/office/drawing/2014/chartex" xmlns:cx1="http://schemas.microsoft.com/office/drawing/2015/9/8/chartex" xmlns:cx2="http://schemas.microsoft.com/office/drawing/2015/10/21/chartex" xmlns:cx3="http://schemas.microsoft.com/office/drawing/2016/5/9/chartex" xmlns:cx4="http://schemas.microsoft.com/office/drawing/2016/5/10/chartex" xmlns:cx5="http://schemas.microsoft.com/office/drawing/2016/5/11/chartex" xmlns:cx6="http://schemas.microsoft.com/office/drawing/2016/5/12/chartex" xmlns:cx7="http://schemas.microsoft.com/office/drawing/2016/5/13/chartex" xmlns:cx8="http://schemas.microsoft.com/office/drawing/2016/5/14/chartex" xmlns:mc="http://schemas.openxmlformats.org/markup-compatibility/2006" xmlns:aink="http://schemas.microsoft.com/office/drawing/2016/ink" xmlns:am3d="http://schemas.microsoft.com/office/drawing/2017/model3d" xmlns:o="urn:schemas-microsoft-com:office:office" xmlns:oel="http://schemas.microsoft.com/office/2019/extlst" xmlns:r="http://schemas.openxmlformats.org/officeDocument/2006/relationships" xmlns:m="http://schemas.openxmlformats.org/officeDocument/2006/math" xmlns:v="urn:schemas-microsoft-com:vml" xmlns:wp14="http://schemas.microsoft.com/office/word/2010/wordprocessingDrawing" xmlns:wp="http://schemas.openxmlformats.org/drawingml/2006/wordprocessingDrawing" xmlns:w10="urn:schemas-microsoft-com:office:word" xmlns:w="http://schemas.openxmlformats.org/wordprocessingml/2006/main" xmlns:w14="http://schemas.microsoft.com/office/word/2010/wordml" xmlns:w15="http://schemas.microsoft.com/office/word/2012/wordml" xmlns:w16cex="http://schemas.microsoft.com/office/word/2018/wordml/cex" xmlns:w16cid="http://schemas.microsoft.com/office/word/2016/wordml/cid" xmlns:w16="http://schemas.microsoft.com/office/word/2018/wordml" xmlns:w16du="http://schemas.microsoft.com/office/word/2023/wordml/word16du" xmlns:w16sdtdh="http://schemas.microsoft.com/office/word/2020/wordml/sdtdatahash" xmlns:w16se="http://schemas.microsoft.com/office/word/2015/wordml/symex" xmlns:wpg="http://schemas.microsoft.com/office/word/2010/wordprocessingGroup" xmlns:wpi="http://schemas.microsoft.com/office/word/2010/wordprocessingInk" xmlns:wne="http://schemas.microsoft.com/office/word/2006/wordml" xmlns:wps="http://schemas.microsoft.com/office/word/2010/wordprocessingShape" mc:Ignorable="w14 w15 w16se w16cid w16 w16cex w16sdtdh wp14">
   <w:footnote w:type="separator" w:id="-1">
     <w:p>
       <w:pPr>
@@ -896,7 +655,7 @@
 </file>
 
 <file path=word/header1.xml><?xml version="1.0" encoding="utf-8"?>
-<w:hdr xmlns:wpc="http://schemas.microsoft.com/office/word/2010/wordprocessingCanvas" xmlns:cx="http://schemas.microsoft.com/office/drawing/2014/chartex" xmlns:cx1="http://schemas.microsoft.com/office/drawing/2015/9/8/chartex" xmlns:mc="http://schemas.openxmlformats.org/markup-compatibility/2006" xmlns:o="urn:schemas-microsoft-com:office:office" xmlns:r="http://schemas.openxmlformats.org/officeDocument/2006/relationships" xmlns:m="http://schemas.openxmlformats.org/officeDocument/2006/math" xmlns:v="urn:schemas-microsoft-com:vml" xmlns:wp14="http://schemas.microsoft.com/office/word/2010/wordprocessingDrawing" xmlns:wp="http://schemas.openxmlformats.org/drawingml/2006/wordprocessingDrawing" xmlns:w10="urn:schemas-microsoft-com:office:word" xmlns:w="http://schemas.openxmlformats.org/wordprocessingml/2006/main" xmlns:w14="http://schemas.microsoft.com/office/word/2010/wordml" xmlns:w15="http://schemas.microsoft.com/office/word/2012/wordml" xmlns:w16se="http://schemas.microsoft.com/office/word/2015/wordml/symex" xmlns:wpg="http://schemas.microsoft.com/office/word/2010/wordprocessingGroup" xmlns:wpi="http://schemas.microsoft.com/office/word/2010/wordprocessingInk" xmlns:wne="http://schemas.microsoft.com/office/word/2006/wordml" xmlns:wps="http://schemas.microsoft.com/office/word/2010/wordprocessingShape" mc:Ignorable="w14 w15 w16se wp14">
+<w:hdr xmlns:wpc="http://schemas.microsoft.com/office/word/2010/wordprocessingCanvas" xmlns:cx="http://schemas.microsoft.com/office/drawing/2014/chartex" xmlns:cx1="http://schemas.microsoft.com/office/drawing/2015/9/8/chartex" xmlns:cx2="http://schemas.microsoft.com/office/drawing/2015/10/21/chartex" xmlns:cx3="http://schemas.microsoft.com/office/drawing/2016/5/9/chartex" xmlns:cx4="http://schemas.microsoft.com/office/drawing/2016/5/10/chartex" xmlns:cx5="http://schemas.microsoft.com/office/drawing/2016/5/11/chartex" xmlns:cx6="http://schemas.microsoft.com/office/drawing/2016/5/12/chartex" xmlns:cx7="http://schemas.microsoft.com/office/drawing/2016/5/13/chartex" xmlns:cx8="http://schemas.microsoft.com/office/drawing/2016/5/14/chartex" xmlns:mc="http://schemas.openxmlformats.org/markup-compatibility/2006" xmlns:aink="http://schemas.microsoft.com/office/drawing/2016/ink" xmlns:am3d="http://schemas.microsoft.com/office/drawing/2017/model3d" xmlns:o="urn:schemas-microsoft-com:office:office" xmlns:oel="http://schemas.microsoft.com/office/2019/extlst" xmlns:r="http://schemas.openxmlformats.org/officeDocument/2006/relationships" xmlns:m="http://schemas.openxmlformats.org/officeDocument/2006/math" xmlns:v="urn:schemas-microsoft-com:vml" xmlns:wp14="http://schemas.microsoft.com/office/word/2010/wordprocessingDrawing" xmlns:wp="http://schemas.openxmlformats.org/drawingml/2006/wordprocessingDrawing" xmlns:w10="urn:schemas-microsoft-com:office:word" xmlns:w="http://schemas.openxmlformats.org/wordprocessingml/2006/main" xmlns:w14="http://schemas.microsoft.com/office/word/2010/wordml" xmlns:w15="http://schemas.microsoft.com/office/word/2012/wordml" xmlns:w16cex="http://schemas.microsoft.com/office/word/2018/wordml/cex" xmlns:w16cid="http://schemas.microsoft.com/office/word/2016/wordml/cid" xmlns:w16="http://schemas.microsoft.com/office/word/2018/wordml" xmlns:w16du="http://schemas.microsoft.com/office/word/2023/wordml/word16du" xmlns:w16sdtdh="http://schemas.microsoft.com/office/word/2020/wordml/sdtdatahash" xmlns:w16se="http://schemas.microsoft.com/office/word/2015/wordml/symex" xmlns:wpg="http://schemas.microsoft.com/office/word/2010/wordprocessingGroup" xmlns:wpi="http://schemas.microsoft.com/office/word/2010/wordprocessingInk" xmlns:wne="http://schemas.microsoft.com/office/word/2006/wordml" xmlns:wps="http://schemas.microsoft.com/office/word/2010/wordprocessingShape" mc:Ignorable="w14 w15 w16se w16cid w16 w16cex w16sdtdh wp14">
   <w:p>
     <w:pPr>
       <w:tabs>
@@ -1143,7 +902,7 @@
 </file>
 
 <file path=word/header2.xml><?xml version="1.0" encoding="utf-8"?>
-<w:hdr xmlns:wpc="http://schemas.microsoft.com/office/word/2010/wordprocessingCanvas" xmlns:cx="http://schemas.microsoft.com/office/drawing/2014/chartex" xmlns:cx1="http://schemas.microsoft.com/office/drawing/2015/9/8/chartex" xmlns:mc="http://schemas.openxmlformats.org/markup-compatibility/2006" xmlns:o="urn:schemas-microsoft-com:office:office" xmlns:r="http://schemas.openxmlformats.org/officeDocument/2006/relationships" xmlns:m="http://schemas.openxmlformats.org/officeDocument/2006/math" xmlns:v="urn:schemas-microsoft-com:vml" xmlns:wp14="http://schemas.microsoft.com/office/word/2010/wordprocessingDrawing" xmlns:wp="http://schemas.openxmlformats.org/drawingml/2006/wordprocessingDrawing" xmlns:w10="urn:schemas-microsoft-com:office:word" xmlns:w="http://schemas.openxmlformats.org/wordprocessingml/2006/main" xmlns:w14="http://schemas.microsoft.com/office/word/2010/wordml" xmlns:w15="http://schemas.microsoft.com/office/word/2012/wordml" xmlns:w16se="http://schemas.microsoft.com/office/word/2015/wordml/symex" xmlns:wpg="http://schemas.microsoft.com/office/word/2010/wordprocessingGroup" xmlns:wpi="http://schemas.microsoft.com/office/word/2010/wordprocessingInk" xmlns:wne="http://schemas.microsoft.com/office/word/2006/wordml" xmlns:wps="http://schemas.microsoft.com/office/word/2010/wordprocessingShape" mc:Ignorable="w14 w15 w16se wp14">
+<w:hdr xmlns:wpc="http://schemas.microsoft.com/office/word/2010/wordprocessingCanvas" xmlns:cx="http://schemas.microsoft.com/office/drawing/2014/chartex" xmlns:cx1="http://schemas.microsoft.com/office/drawing/2015/9/8/chartex" xmlns:cx2="http://schemas.microsoft.com/office/drawing/2015/10/21/chartex" xmlns:cx3="http://schemas.microsoft.com/office/drawing/2016/5/9/chartex" xmlns:cx4="http://schemas.microsoft.com/office/drawing/2016/5/10/chartex" xmlns:cx5="http://schemas.microsoft.com/office/drawing/2016/5/11/chartex" xmlns:cx6="http://schemas.microsoft.com/office/drawing/2016/5/12/chartex" xmlns:cx7="http://schemas.microsoft.com/office/drawing/2016/5/13/chartex" xmlns:cx8="http://schemas.microsoft.com/office/drawing/2016/5/14/chartex" xmlns:mc="http://schemas.openxmlformats.org/markup-compatibility/2006" xmlns:aink="http://schemas.microsoft.com/office/drawing/2016/ink" xmlns:am3d="http://schemas.microsoft.com/office/drawing/2017/model3d" xmlns:o="urn:schemas-microsoft-com:office:office" xmlns:oel="http://schemas.microsoft.com/office/2019/extlst" xmlns:r="http://schemas.openxmlformats.org/officeDocument/2006/relationships" xmlns:m="http://schemas.openxmlformats.org/officeDocument/2006/math" xmlns:v="urn:schemas-microsoft-com:vml" xmlns:wp14="http://schemas.microsoft.com/office/word/2010/wordprocessingDrawing" xmlns:wp="http://schemas.openxmlformats.org/drawingml/2006/wordprocessingDrawing" xmlns:w10="urn:schemas-microsoft-com:office:word" xmlns:w="http://schemas.openxmlformats.org/wordprocessingml/2006/main" xmlns:w14="http://schemas.microsoft.com/office/word/2010/wordml" xmlns:w15="http://schemas.microsoft.com/office/word/2012/wordml" xmlns:w16cex="http://schemas.microsoft.com/office/word/2018/wordml/cex" xmlns:w16cid="http://schemas.microsoft.com/office/word/2016/wordml/cid" xmlns:w16="http://schemas.microsoft.com/office/word/2018/wordml" xmlns:w16du="http://schemas.microsoft.com/office/word/2023/wordml/word16du" xmlns:w16sdtdh="http://schemas.microsoft.com/office/word/2020/wordml/sdtdatahash" xmlns:w16se="http://schemas.microsoft.com/office/word/2015/wordml/symex" xmlns:wpg="http://schemas.microsoft.com/office/word/2010/wordprocessingGroup" xmlns:wpi="http://schemas.microsoft.com/office/word/2010/wordprocessingInk" xmlns:wne="http://schemas.microsoft.com/office/word/2006/wordml" xmlns:wps="http://schemas.microsoft.com/office/word/2010/wordprocessingShape" mc:Ignorable="w14 w15 w16se w16cid w16 w16cex w16sdtdh wp14">
   <w:p>
     <w:pPr>
       <w:tabs>
@@ -1157,83 +916,7 @@
       <mc:AlternateContent>
         <mc:Choice Requires="wps">
           <w:drawing>
-            <wp:anchor distT="4294967295" distB="4294967295" distL="114300" distR="114300" simplePos="0" relativeHeight="251657216" behindDoc="1" locked="1" layoutInCell="1" allowOverlap="1" wp14:anchorId="4EC4F66C" wp14:editId="4EC4F66D">
-              <wp:simplePos x="0" y="0"/>
-              <wp:positionH relativeFrom="page">
-                <wp:posOffset>1080135</wp:posOffset>
-              </wp:positionH>
-              <wp:positionV relativeFrom="page">
-                <wp:posOffset>10045064</wp:posOffset>
-              </wp:positionV>
-              <wp:extent cx="5760085" cy="0"/>
-              <wp:effectExtent l="0" t="0" r="12065" b="19050"/>
-              <wp:wrapNone/>
-              <wp:docPr id="5" name="Line 31"/>
-              <wp:cNvGraphicFramePr>
-                <a:graphicFrameLocks xmlns:a="http://schemas.openxmlformats.org/drawingml/2006/main"/>
-              </wp:cNvGraphicFramePr>
-              <a:graphic xmlns:a="http://schemas.openxmlformats.org/drawingml/2006/main">
-                <a:graphicData uri="http://schemas.microsoft.com/office/word/2010/wordprocessingShape">
-                  <wps:wsp>
-                    <wps:cNvCnPr>
-                      <a:cxnSpLocks noChangeShapeType="1"/>
-                    </wps:cNvCnPr>
-                    <wps:spPr bwMode="auto">
-                      <a:xfrm>
-                        <a:off x="0" y="0"/>
-                        <a:ext cx="5760085" cy="0"/>
-                      </a:xfrm>
-                      <a:prstGeom prst="line">
-                        <a:avLst/>
-                      </a:prstGeom>
-                      <a:noFill/>
-                      <a:ln w="6350">
-                        <a:solidFill>
-                          <a:srgbClr val="000000"/>
-                        </a:solidFill>
-                        <a:round/>
-                        <a:headEnd/>
-                        <a:tailEnd/>
-                      </a:ln>
-                      <a:extLst>
-                        <a:ext uri="{909E8E84-426E-40DD-AFC4-6F175D3DCCD1}">
-                          <a14:hiddenFill xmlns:a14="http://schemas.microsoft.com/office/drawing/2010/main">
-                            <a:noFill/>
-                          </a14:hiddenFill>
-                        </a:ext>
-                      </a:extLst>
-                    </wps:spPr>
-                    <wps:bodyPr/>
-                  </wps:wsp>
-                </a:graphicData>
-              </a:graphic>
-              <wp14:sizeRelH relativeFrom="page">
-                <wp14:pctWidth>0</wp14:pctWidth>
-              </wp14:sizeRelH>
-              <wp14:sizeRelV relativeFrom="page">
-                <wp14:pctHeight>0</wp14:pctHeight>
-              </wp14:sizeRelV>
-            </wp:anchor>
-          </w:drawing>
-        </mc:Choice>
-        <mc:Fallback>
-          <w:pict>
-            <v:line w14:anchorId="2C195BDE" id="Line 31" o:spid="_x0000_s1026" style="position:absolute;z-index:-251659264;visibility:visible;mso-wrap-style:square;mso-width-percent:0;mso-height-percent:0;mso-wrap-distance-left:9pt;mso-wrap-distance-top:-3e-5mm;mso-wrap-distance-right:9pt;mso-wrap-distance-bottom:-3e-5mm;mso-position-horizontal:absolute;mso-position-horizontal-relative:page;mso-position-vertical:absolute;mso-position-vertical-relative:page;mso-width-percent:0;mso-height-percent:0;mso-width-relative:page;mso-height-relative:page" from="85.05pt,790.95pt" to="538.6pt,790.95pt" o:gfxdata="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" strokeweight=".5pt">
-              <w10:wrap anchorx="page" anchory="page"/>
-              <w10:anchorlock/>
-            </v:line>
-          </w:pict>
-        </mc:Fallback>
-      </mc:AlternateContent>
-    </w:r>
-    <w:r>
-      <w:rPr>
-        <w:noProof/>
-      </w:rPr>
-      <mc:AlternateContent>
-        <mc:Choice Requires="wps">
-          <w:drawing>
-            <wp:anchor distT="0" distB="0" distL="114300" distR="114300" simplePos="0" relativeHeight="251656192" behindDoc="1" locked="1" layoutInCell="1" allowOverlap="1" wp14:anchorId="4EC4F66E" wp14:editId="4EC4F66F">
+            <wp:anchor distT="0" distB="0" distL="114300" distR="114300" simplePos="0" relativeHeight="251656192" behindDoc="1" locked="1" layoutInCell="1" allowOverlap="1" wp14:anchorId="4EC4F66E" wp14:editId="53FEE657">
               <wp:simplePos x="0" y="0"/>
               <wp:positionH relativeFrom="page">
                 <wp:posOffset>1080135</wp:posOffset>
@@ -1298,7 +981,7 @@
         </mc:Choice>
         <mc:Fallback>
           <w:pict>
-            <v:rect w14:anchorId="48B9706B" id="Rectangle 30" o:spid="_x0000_s1026" style="position:absolute;margin-left:85.05pt;margin-top:42.55pt;width:453.55pt;height:11.35pt;z-index:-251660288;visibility:visible;mso-wrap-style:square;mso-width-percent:0;mso-height-percent:0;mso-wrap-distance-left:9pt;mso-wrap-distance-top:0;mso-wrap-distance-right:9pt;mso-wrap-distance-bottom:0;mso-position-horizontal:absolute;mso-position-horizontal-relative:page;mso-position-vertical:absolute;mso-position-vertical-relative:page;mso-width-percent:0;mso-height-percent:0;mso-width-relative:page;mso-height-relative:page;v-text-anchor:top" o:gfxdata="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" fillcolor="#b90f22" stroked="f" strokecolor="#b5b5b5" strokeweight=".25pt">
+            <v:rect w14:anchorId="776689AA" id="Rectangle 30" o:spid="_x0000_s1026" style="position:absolute;margin-left:85.05pt;margin-top:42.55pt;width:453.55pt;height:11.35pt;z-index:-251660288;visibility:visible;mso-wrap-style:square;mso-width-percent:0;mso-height-percent:0;mso-wrap-distance-left:9pt;mso-wrap-distance-top:0;mso-wrap-distance-right:9pt;mso-wrap-distance-bottom:0;mso-position-horizontal:absolute;mso-position-horizontal-relative:page;mso-position-vertical:absolute;mso-position-vertical-relative:page;mso-width-percent:0;mso-height-percent:0;mso-width-relative:page;mso-height-relative:page;v-text-anchor:top" o:gfxdata="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" fillcolor="#b90f22" stroked="f" strokecolor="#b5b5b5" strokeweight=".25pt">
               <w10:wrap anchorx="page" anchory="page"/>
               <w10:anchorlock/>
             </v:rect>
@@ -1386,18 +1069,8 @@
 </w:hdr>
 </file>
 
-<file path=word/header3.xml><?xml version="1.0" encoding="utf-8"?>
-<w:hdr xmlns:wpc="http://schemas.microsoft.com/office/word/2010/wordprocessingCanvas" xmlns:cx="http://schemas.microsoft.com/office/drawing/2014/chartex" xmlns:cx1="http://schemas.microsoft.com/office/drawing/2015/9/8/chartex" xmlns:mc="http://schemas.openxmlformats.org/markup-compatibility/2006" xmlns:o="urn:schemas-microsoft-com:office:office" xmlns:r="http://schemas.openxmlformats.org/officeDocument/2006/relationships" xmlns:m="http://schemas.openxmlformats.org/officeDocument/2006/math" xmlns:v="urn:schemas-microsoft-com:vml" xmlns:wp14="http://schemas.microsoft.com/office/word/2010/wordprocessingDrawing" xmlns:wp="http://schemas.openxmlformats.org/drawingml/2006/wordprocessingDrawing" xmlns:w10="urn:schemas-microsoft-com:office:word" xmlns:w="http://schemas.openxmlformats.org/wordprocessingml/2006/main" xmlns:w14="http://schemas.microsoft.com/office/word/2010/wordml" xmlns:w15="http://schemas.microsoft.com/office/word/2012/wordml" xmlns:w16se="http://schemas.microsoft.com/office/word/2015/wordml/symex" xmlns:wpg="http://schemas.microsoft.com/office/word/2010/wordprocessingGroup" xmlns:wpi="http://schemas.microsoft.com/office/word/2010/wordprocessingInk" xmlns:wne="http://schemas.microsoft.com/office/word/2006/wordml" xmlns:wps="http://schemas.microsoft.com/office/word/2010/wordprocessingShape" mc:Ignorable="w14 w15 w16se wp14">
-  <w:p>
-    <w:pPr>
-      <w:pStyle w:val="Kopfzeile"/>
-    </w:pPr>
-  </w:p>
-</w:hdr>
-</file>
-
 <file path=word/numbering.xml><?xml version="1.0" encoding="utf-8"?>
-<w:numbering xmlns:wpc="http://schemas.microsoft.com/office/word/2010/wordprocessingCanvas" xmlns:cx="http://schemas.microsoft.com/office/drawing/2014/chartex" xmlns:cx1="http://schemas.microsoft.com/office/drawing/2015/9/8/chartex" xmlns:mc="http://schemas.openxmlformats.org/markup-compatibility/2006" xmlns:o="urn:schemas-microsoft-com:office:office" xmlns:r="http://schemas.openxmlformats.org/officeDocument/2006/relationships" xmlns:m="http://schemas.openxmlformats.org/officeDocument/2006/math" xmlns:v="urn:schemas-microsoft-com:vml" xmlns:wp14="http://schemas.microsoft.com/office/word/2010/wordprocessingDrawing" xmlns:wp="http://schemas.openxmlformats.org/drawingml/2006/wordprocessingDrawing" xmlns:w10="urn:schemas-microsoft-com:office:word" xmlns:w="http://schemas.openxmlformats.org/wordprocessingml/2006/main" xmlns:w14="http://schemas.microsoft.com/office/word/2010/wordml" xmlns:w15="http://schemas.microsoft.com/office/word/2012/wordml" xmlns:w16se="http://schemas.microsoft.com/office/word/2015/wordml/symex" xmlns:wpg="http://schemas.microsoft.com/office/word/2010/wordprocessingGroup" xmlns:wpi="http://schemas.microsoft.com/office/word/2010/wordprocessingInk" xmlns:wne="http://schemas.microsoft.com/office/word/2006/wordml" xmlns:wps="http://schemas.microsoft.com/office/word/2010/wordprocessingShape" mc:Ignorable="w14 w15 w16se wp14">
+<w:numbering xmlns:wpc="http://schemas.microsoft.com/office/word/2010/wordprocessingCanvas" xmlns:cx="http://schemas.microsoft.com/office/drawing/2014/chartex" xmlns:cx1="http://schemas.microsoft.com/office/drawing/2015/9/8/chartex" xmlns:cx2="http://schemas.microsoft.com/office/drawing/2015/10/21/chartex" xmlns:cx3="http://schemas.microsoft.com/office/drawing/2016/5/9/chartex" xmlns:cx4="http://schemas.microsoft.com/office/drawing/2016/5/10/chartex" xmlns:cx5="http://schemas.microsoft.com/office/drawing/2016/5/11/chartex" xmlns:cx6="http://schemas.microsoft.com/office/drawing/2016/5/12/chartex" xmlns:cx7="http://schemas.microsoft.com/office/drawing/2016/5/13/chartex" xmlns:cx8="http://schemas.microsoft.com/office/drawing/2016/5/14/chartex" xmlns:mc="http://schemas.openxmlformats.org/markup-compatibility/2006" xmlns:aink="http://schemas.microsoft.com/office/drawing/2016/ink" xmlns:am3d="http://schemas.microsoft.com/office/drawing/2017/model3d" xmlns:o="urn:schemas-microsoft-com:office:office" xmlns:oel="http://schemas.microsoft.com/office/2019/extlst" xmlns:r="http://schemas.openxmlformats.org/officeDocument/2006/relationships" xmlns:m="http://schemas.openxmlformats.org/officeDocument/2006/math" xmlns:v="urn:schemas-microsoft-com:vml" xmlns:wp14="http://schemas.microsoft.com/office/word/2010/wordprocessingDrawing" xmlns:wp="http://schemas.openxmlformats.org/drawingml/2006/wordprocessingDrawing" xmlns:w10="urn:schemas-microsoft-com:office:word" xmlns:w="http://schemas.openxmlformats.org/wordprocessingml/2006/main" xmlns:w14="http://schemas.microsoft.com/office/word/2010/wordml" xmlns:w15="http://schemas.microsoft.com/office/word/2012/wordml" xmlns:w16cex="http://schemas.microsoft.com/office/word/2018/wordml/cex" xmlns:w16cid="http://schemas.microsoft.com/office/word/2016/wordml/cid" xmlns:w16="http://schemas.microsoft.com/office/word/2018/wordml" xmlns:w16du="http://schemas.microsoft.com/office/word/2023/wordml/word16du" xmlns:w16sdtdh="http://schemas.microsoft.com/office/word/2020/wordml/sdtdatahash" xmlns:w16se="http://schemas.microsoft.com/office/word/2015/wordml/symex" xmlns:wpg="http://schemas.microsoft.com/office/word/2010/wordprocessingGroup" xmlns:wpi="http://schemas.microsoft.com/office/word/2010/wordprocessingInk" xmlns:wne="http://schemas.microsoft.com/office/word/2006/wordml" xmlns:wps="http://schemas.microsoft.com/office/word/2010/wordprocessingShape" mc:Ignorable="w14 w15 w16se w16cid w16 w16cex w16sdtdh wp14">
   <w:abstractNum w:abstractNumId="0" w15:restartNumberingAfterBreak="0">
     <w:nsid w:val="10FE23FB"/>
     <w:multiLevelType w:val="hybridMultilevel"/>
@@ -1831,7 +1504,7 @@
     <w:lvl w:ilvl="0">
       <w:start w:val="1"/>
       <w:numFmt w:val="decimal"/>
-      <w:pStyle w:val="berschrift1"/>
+      <w:pStyle w:val="Heading1"/>
       <w:lvlText w:val="%1."/>
       <w:lvlJc w:val="left"/>
       <w:pPr>
@@ -1847,7 +1520,7 @@
     <w:lvl w:ilvl="1">
       <w:start w:val="1"/>
       <w:numFmt w:val="decimal"/>
-      <w:pStyle w:val="berschrift2"/>
+      <w:pStyle w:val="Heading2"/>
       <w:lvlText w:val="%1.%2."/>
       <w:lvlJc w:val="left"/>
       <w:pPr>
@@ -1863,7 +1536,7 @@
     <w:lvl w:ilvl="2">
       <w:start w:val="1"/>
       <w:numFmt w:val="decimal"/>
-      <w:pStyle w:val="berschrift3"/>
+      <w:pStyle w:val="Heading3"/>
       <w:lvlText w:val="%1.%2.%3."/>
       <w:lvlJc w:val="left"/>
       <w:pPr>
@@ -2014,7 +1687,7 @@
     <w:lvl w:ilvl="3">
       <w:start w:val="1"/>
       <w:numFmt w:val="none"/>
-      <w:pStyle w:val="berschrift4"/>
+      <w:pStyle w:val="Heading4"/>
       <w:suff w:val="nothing"/>
       <w:lvlText w:val=""/>
       <w:lvlJc w:val="left"/>
@@ -2113,22 +1786,22 @@
       </w:rPr>
     </w:lvl>
   </w:abstractNum>
-  <w:num w:numId="1">
+  <w:num w:numId="1" w16cid:durableId="576129750">
     <w:abstractNumId w:val="1"/>
   </w:num>
-  <w:num w:numId="2">
+  <w:num w:numId="2" w16cid:durableId="709035569">
     <w:abstractNumId w:val="2"/>
   </w:num>
-  <w:num w:numId="3">
+  <w:num w:numId="3" w16cid:durableId="666635104">
     <w:abstractNumId w:val="5"/>
   </w:num>
-  <w:num w:numId="4">
+  <w:num w:numId="4" w16cid:durableId="619727611">
     <w:abstractNumId w:val="3"/>
   </w:num>
-  <w:num w:numId="5">
+  <w:num w:numId="5" w16cid:durableId="1174881338">
     <w:abstractNumId w:val="4"/>
   </w:num>
-  <w:num w:numId="6">
+  <w:num w:numId="6" w16cid:durableId="413629479">
     <w:abstractNumId w:val="0"/>
   </w:num>
   <w:numIdMacAtCleanup w:val="6"/>
@@ -2136,7 +1809,7 @@
 </file>
 
 <file path=word/styles.xml><?xml version="1.0" encoding="utf-8"?>
-<w:styles xmlns:mc="http://schemas.openxmlformats.org/markup-compatibility/2006" xmlns:r="http://schemas.openxmlformats.org/officeDocument/2006/relationships" xmlns:w="http://schemas.openxmlformats.org/wordprocessingml/2006/main" xmlns:w14="http://schemas.microsoft.com/office/word/2010/wordml" xmlns:w15="http://schemas.microsoft.com/office/word/2012/wordml" xmlns:w16se="http://schemas.microsoft.com/office/word/2015/wordml/symex" mc:Ignorable="w14 w15 w16se">
+<w:styles xmlns:mc="http://schemas.openxmlformats.org/markup-compatibility/2006" xmlns:r="http://schemas.openxmlformats.org/officeDocument/2006/relationships" xmlns:w="http://schemas.openxmlformats.org/wordprocessingml/2006/main" xmlns:w14="http://schemas.microsoft.com/office/word/2010/wordml" xmlns:w15="http://schemas.microsoft.com/office/word/2012/wordml" xmlns:w16cex="http://schemas.microsoft.com/office/word/2018/wordml/cex" xmlns:w16cid="http://schemas.microsoft.com/office/word/2016/wordml/cid" xmlns:w16="http://schemas.microsoft.com/office/word/2018/wordml" xmlns:w16sdtdh="http://schemas.microsoft.com/office/word/2020/wordml/sdtdatahash" xmlns:w16se="http://schemas.microsoft.com/office/word/2015/wordml/symex" mc:Ignorable="w14 w15 w16se w16cid w16 w16cex w16sdtdh">
   <w:docDefaults>
     <w:rPrDefault>
       <w:rPr>
@@ -2146,7 +1819,7 @@
     </w:rPrDefault>
     <w:pPrDefault/>
   </w:docDefaults>
-  <w:latentStyles w:defLockedState="0" w:defUIPriority="99" w:defSemiHidden="0" w:defUnhideWhenUsed="0" w:defQFormat="0" w:count="371">
+  <w:latentStyles w:defLockedState="0" w:defUIPriority="99" w:defSemiHidden="0" w:defUnhideWhenUsed="0" w:defQFormat="0" w:count="376">
     <w:lsdException w:name="Normal" w:uiPriority="0" w:qFormat="1"/>
     <w:lsdException w:name="heading 1" w:uiPriority="9" w:qFormat="1"/>
     <w:lsdException w:name="heading 2" w:uiPriority="9" w:qFormat="1"/>
@@ -2518,8 +2191,13 @@
     <w:lsdException w:name="List Table 5 Dark Accent 6" w:uiPriority="50"/>
     <w:lsdException w:name="List Table 6 Colorful Accent 6" w:uiPriority="51"/>
     <w:lsdException w:name="List Table 7 Colorful Accent 6" w:uiPriority="52"/>
+    <w:lsdException w:name="Mention" w:semiHidden="1" w:unhideWhenUsed="1"/>
+    <w:lsdException w:name="Smart Hyperlink" w:semiHidden="1" w:unhideWhenUsed="1"/>
+    <w:lsdException w:name="Hashtag" w:semiHidden="1" w:unhideWhenUsed="1"/>
+    <w:lsdException w:name="Unresolved Mention" w:semiHidden="1" w:unhideWhenUsed="1"/>
+    <w:lsdException w:name="Smart Link" w:semiHidden="1" w:unhideWhenUsed="1"/>
   </w:latentStyles>
-  <w:style w:type="paragraph" w:default="1" w:styleId="Standard">
+  <w:style w:type="paragraph" w:default="1" w:styleId="Normal">
     <w:name w:val="Normal"/>
     <w:qFormat/>
     <w:rsid w:val="002A2F31"/>
@@ -2532,10 +2210,10 @@
       <w:szCs w:val="19"/>
     </w:rPr>
   </w:style>
-  <w:style w:type="paragraph" w:styleId="berschrift1">
+  <w:style w:type="paragraph" w:styleId="Heading1">
     <w:name w:val="heading 1"/>
-    <w:basedOn w:val="Standard"/>
-    <w:next w:val="Standard"/>
+    <w:basedOn w:val="Normal"/>
+    <w:next w:val="Normal"/>
     <w:qFormat/>
     <w:rsid w:val="00D341C4"/>
     <w:pPr>
@@ -2561,10 +2239,10 @@
       <w:sz w:val="24"/>
     </w:rPr>
   </w:style>
-  <w:style w:type="paragraph" w:styleId="berschrift2">
+  <w:style w:type="paragraph" w:styleId="Heading2">
     <w:name w:val="heading 2"/>
-    <w:basedOn w:val="Standard"/>
-    <w:next w:val="Standard"/>
+    <w:basedOn w:val="Normal"/>
+    <w:next w:val="Normal"/>
     <w:qFormat/>
     <w:rsid w:val="00AB5B86"/>
     <w:pPr>
@@ -2585,10 +2263,10 @@
       <w:szCs w:val="20"/>
     </w:rPr>
   </w:style>
-  <w:style w:type="paragraph" w:styleId="berschrift3">
+  <w:style w:type="paragraph" w:styleId="Heading3">
     <w:name w:val="heading 3"/>
-    <w:basedOn w:val="Standard"/>
-    <w:next w:val="Standard"/>
+    <w:basedOn w:val="Normal"/>
+    <w:next w:val="Normal"/>
     <w:qFormat/>
     <w:rsid w:val="002E2259"/>
     <w:pPr>
@@ -2608,10 +2286,10 @@
       <w:szCs w:val="24"/>
     </w:rPr>
   </w:style>
-  <w:style w:type="paragraph" w:styleId="berschrift4">
+  <w:style w:type="paragraph" w:styleId="Heading4">
     <w:name w:val="heading 4"/>
-    <w:basedOn w:val="Standard"/>
-    <w:next w:val="Standard"/>
+    <w:basedOn w:val="Normal"/>
+    <w:next w:val="Normal"/>
     <w:qFormat/>
     <w:rsid w:val="00DB2253"/>
     <w:pPr>
@@ -2628,13 +2306,13 @@
       <w:b/>
     </w:rPr>
   </w:style>
-  <w:style w:type="character" w:default="1" w:styleId="Absatz-Standardschriftart">
+  <w:style w:type="character" w:default="1" w:styleId="DefaultParagraphFont">
     <w:name w:val="Default Paragraph Font"/>
     <w:uiPriority w:val="1"/>
     <w:semiHidden/>
     <w:unhideWhenUsed/>
   </w:style>
-  <w:style w:type="table" w:default="1" w:styleId="NormaleTabelle">
+  <w:style w:type="table" w:default="1" w:styleId="TableNormal">
     <w:name w:val="Normal Table"/>
     <w:uiPriority w:val="99"/>
     <w:semiHidden/>
@@ -2649,7 +2327,7 @@
       </w:tblCellMar>
     </w:tblPr>
   </w:style>
-  <w:style w:type="numbering" w:default="1" w:styleId="KeineListe">
+  <w:style w:type="numbering" w:default="1" w:styleId="NoList">
     <w:name w:val="No List"/>
     <w:uiPriority w:val="99"/>
     <w:semiHidden/>
@@ -2657,7 +2335,7 @@
   </w:style>
   <w:style w:type="paragraph" w:customStyle="1" w:styleId="Formatvorlage1">
     <w:name w:val="Formatvorlage1"/>
-    <w:basedOn w:val="Standard"/>
+    <w:basedOn w:val="Normal"/>
     <w:semiHidden/>
     <w:rsid w:val="007A630F"/>
     <w:pPr>
@@ -2672,7 +2350,7 @@
   </w:style>
   <w:style w:type="paragraph" w:customStyle="1" w:styleId="StandardAufzhlung">
     <w:name w:val="Standard_Aufzählung"/>
-    <w:basedOn w:val="Standard"/>
+    <w:basedOn w:val="Normal"/>
     <w:rsid w:val="002F34CC"/>
     <w:pPr>
       <w:numPr>
@@ -2685,20 +2363,20 @@
       <w:ind w:left="0" w:firstLine="0"/>
     </w:pPr>
   </w:style>
-  <w:style w:type="paragraph" w:styleId="Abbildungsverzeichnis">
+  <w:style w:type="paragraph" w:styleId="TableofFigures">
     <w:name w:val="table of figures"/>
-    <w:basedOn w:val="Standard"/>
-    <w:next w:val="Standard"/>
+    <w:basedOn w:val="Normal"/>
+    <w:next w:val="Normal"/>
     <w:semiHidden/>
     <w:rsid w:val="00284359"/>
     <w:pPr>
       <w:ind w:left="440" w:hanging="440"/>
     </w:pPr>
   </w:style>
-  <w:style w:type="paragraph" w:styleId="Verzeichnis1">
+  <w:style w:type="paragraph" w:styleId="TOC1">
     <w:name w:val="toc 1"/>
-    <w:basedOn w:val="Standard"/>
-    <w:next w:val="Standard"/>
+    <w:basedOn w:val="Normal"/>
+    <w:next w:val="Normal"/>
     <w:autoRedefine/>
     <w:semiHidden/>
     <w:rsid w:val="00D524F5"/>
@@ -2732,7 +2410,7 @@
   </w:style>
   <w:style w:type="paragraph" w:customStyle="1" w:styleId="Einzug1">
     <w:name w:val="Einzug_1"/>
-    <w:basedOn w:val="Standard"/>
+    <w:basedOn w:val="Normal"/>
     <w:semiHidden/>
     <w:rsid w:val="001C6479"/>
     <w:pPr>
@@ -2752,7 +2430,7 @@
   </w:style>
   <w:style w:type="paragraph" w:customStyle="1" w:styleId="fotos">
     <w:name w:val="fotos"/>
-    <w:basedOn w:val="Standard"/>
+    <w:basedOn w:val="Normal"/>
     <w:rsid w:val="003C557A"/>
     <w:pPr>
       <w:numPr>
@@ -2763,7 +2441,7 @@
   </w:style>
   <w:style w:type="paragraph" w:customStyle="1" w:styleId="quellcode">
     <w:name w:val="quellcode"/>
-    <w:basedOn w:val="Standard"/>
+    <w:basedOn w:val="Normal"/>
     <w:semiHidden/>
     <w:rsid w:val="007D23AB"/>
     <w:pPr>
@@ -2776,9 +2454,9 @@
       <w:lang w:val="en-GB"/>
     </w:rPr>
   </w:style>
-  <w:style w:type="paragraph" w:styleId="Fuzeile">
+  <w:style w:type="paragraph" w:styleId="Footer">
     <w:name w:val="footer"/>
-    <w:basedOn w:val="Standard"/>
+    <w:basedOn w:val="Normal"/>
     <w:rsid w:val="002F34CC"/>
     <w:pPr>
       <w:tabs>
@@ -2793,8 +2471,8 @@
   </w:style>
   <w:style w:type="paragraph" w:styleId="Index1">
     <w:name w:val="index 1"/>
-    <w:basedOn w:val="Standard"/>
-    <w:next w:val="Standard"/>
+    <w:basedOn w:val="Normal"/>
+    <w:next w:val="Normal"/>
     <w:autoRedefine/>
     <w:semiHidden/>
     <w:rsid w:val="006152F2"/>
@@ -2804,17 +2482,17 @@
   </w:style>
   <w:style w:type="paragraph" w:customStyle="1" w:styleId="Literatur">
     <w:name w:val="Literatur"/>
-    <w:basedOn w:val="Standard"/>
-    <w:next w:val="Standard"/>
+    <w:basedOn w:val="Normal"/>
+    <w:next w:val="Normal"/>
     <w:link w:val="LiteraturChar"/>
     <w:rsid w:val="006152F2"/>
     <w:pPr>
       <w:spacing w:after="120" w:line="240" w:lineRule="auto"/>
     </w:pPr>
   </w:style>
-  <w:style w:type="table" w:styleId="Tabellenraster">
+  <w:style w:type="table" w:styleId="TableGrid">
     <w:name w:val="Table Grid"/>
-    <w:basedOn w:val="NormaleTabelle"/>
+    <w:basedOn w:val="TableNormal"/>
     <w:semiHidden/>
     <w:rsid w:val="00795B43"/>
     <w:tblPr>
@@ -2828,7 +2506,7 @@
       </w:tblBorders>
     </w:tblPr>
   </w:style>
-  <w:style w:type="character" w:styleId="Seitenzahl">
+  <w:style w:type="character" w:styleId="PageNumber">
     <w:name w:val="page number"/>
     <w:rsid w:val="000969FE"/>
     <w:rPr>
@@ -2838,9 +2516,9 @@
       <w:szCs w:val="20"/>
     </w:rPr>
   </w:style>
-  <w:style w:type="paragraph" w:styleId="Funotentext">
+  <w:style w:type="paragraph" w:styleId="FootnoteText">
     <w:name w:val="footnote text"/>
-    <w:basedOn w:val="Standard"/>
+    <w:basedOn w:val="Normal"/>
     <w:rsid w:val="00D67254"/>
     <w:pPr>
       <w:ind w:left="397" w:hanging="397"/>
@@ -2850,17 +2528,17 @@
       <w:szCs w:val="20"/>
     </w:rPr>
   </w:style>
-  <w:style w:type="character" w:styleId="Funotenzeichen">
+  <w:style w:type="character" w:styleId="FootnoteReference">
     <w:name w:val="footnote reference"/>
     <w:rsid w:val="00D67254"/>
     <w:rPr>
       <w:vertAlign w:val="superscript"/>
     </w:rPr>
   </w:style>
-  <w:style w:type="paragraph" w:styleId="Beschriftung">
+  <w:style w:type="paragraph" w:styleId="Caption">
     <w:name w:val="caption"/>
-    <w:basedOn w:val="Standard"/>
-    <w:next w:val="Standard"/>
+    <w:basedOn w:val="Normal"/>
+    <w:next w:val="Normal"/>
     <w:qFormat/>
     <w:rsid w:val="00497656"/>
     <w:pPr>
@@ -2907,10 +2585,10 @@
       <w:lang w:val="de-DE" w:eastAsia="de-DE" w:bidi="ar-SA"/>
     </w:rPr>
   </w:style>
-  <w:style w:type="paragraph" w:styleId="Verzeichnis2">
+  <w:style w:type="paragraph" w:styleId="TOC2">
     <w:name w:val="toc 2"/>
-    <w:basedOn w:val="Standard"/>
-    <w:next w:val="Standard"/>
+    <w:basedOn w:val="Normal"/>
+    <w:next w:val="Normal"/>
     <w:autoRedefine/>
     <w:uiPriority w:val="39"/>
     <w:rsid w:val="002F34CC"/>
@@ -2923,10 +2601,10 @@
       <w:ind w:left="851" w:hanging="851"/>
     </w:pPr>
   </w:style>
-  <w:style w:type="paragraph" w:styleId="Verzeichnis3">
+  <w:style w:type="paragraph" w:styleId="TOC3">
     <w:name w:val="toc 3"/>
-    <w:basedOn w:val="Standard"/>
-    <w:next w:val="Standard"/>
+    <w:basedOn w:val="Normal"/>
+    <w:next w:val="Normal"/>
     <w:autoRedefine/>
     <w:uiPriority w:val="39"/>
     <w:rsid w:val="002F34CC"/>
@@ -2941,17 +2619,17 @@
   </w:style>
   <w:style w:type="paragraph" w:customStyle="1" w:styleId="Inhaltsverzeichnis">
     <w:name w:val="Inhaltsverzeichnis"/>
-    <w:basedOn w:val="Verzeichnis2"/>
+    <w:basedOn w:val="TOC2"/>
     <w:qFormat/>
     <w:rsid w:val="002A2F31"/>
     <w:rPr>
       <w:noProof/>
     </w:rPr>
   </w:style>
-  <w:style w:type="paragraph" w:styleId="Inhaltsverzeichnisberschrift">
+  <w:style w:type="paragraph" w:styleId="TOCHeading">
     <w:name w:val="TOC Heading"/>
-    <w:basedOn w:val="berschrift1"/>
-    <w:next w:val="Standard"/>
+    <w:basedOn w:val="Heading1"/>
+    <w:next w:val="Normal"/>
     <w:uiPriority w:val="39"/>
     <w:semiHidden/>
     <w:unhideWhenUsed/>
@@ -2993,10 +2671,10 @@
       <w:u w:val="single"/>
     </w:rPr>
   </w:style>
-  <w:style w:type="paragraph" w:styleId="Sprechblasentext">
+  <w:style w:type="paragraph" w:styleId="BalloonText">
     <w:name w:val="Balloon Text"/>
-    <w:basedOn w:val="Standard"/>
-    <w:link w:val="SprechblasentextZchn"/>
+    <w:basedOn w:val="Normal"/>
+    <w:link w:val="BalloonTextChar"/>
     <w:uiPriority w:val="99"/>
     <w:semiHidden/>
     <w:unhideWhenUsed/>
@@ -3010,9 +2688,9 @@
       <w:szCs w:val="16"/>
     </w:rPr>
   </w:style>
-  <w:style w:type="character" w:customStyle="1" w:styleId="SprechblasentextZchn">
-    <w:name w:val="Sprechblasentext Zchn"/>
-    <w:link w:val="Sprechblasentext"/>
+  <w:style w:type="character" w:customStyle="1" w:styleId="BalloonTextChar">
+    <w:name w:val="Balloon Text Char"/>
+    <w:link w:val="BalloonText"/>
     <w:uiPriority w:val="99"/>
     <w:semiHidden/>
     <w:rsid w:val="00A94CC5"/>
@@ -3022,10 +2700,10 @@
       <w:szCs w:val="16"/>
     </w:rPr>
   </w:style>
-  <w:style w:type="paragraph" w:styleId="Kopfzeile">
+  <w:style w:type="paragraph" w:styleId="Header">
     <w:name w:val="header"/>
-    <w:basedOn w:val="Standard"/>
-    <w:link w:val="KopfzeileZchn"/>
+    <w:basedOn w:val="Normal"/>
+    <w:link w:val="HeaderChar"/>
     <w:uiPriority w:val="99"/>
     <w:unhideWhenUsed/>
     <w:rsid w:val="002F34CC"/>
@@ -3037,9 +2715,9 @@
       <w:spacing w:after="0" w:line="240" w:lineRule="auto"/>
     </w:pPr>
   </w:style>
-  <w:style w:type="character" w:customStyle="1" w:styleId="KopfzeileZchn">
-    <w:name w:val="Kopfzeile Zchn"/>
-    <w:link w:val="Kopfzeile"/>
+  <w:style w:type="character" w:customStyle="1" w:styleId="HeaderChar">
+    <w:name w:val="Header Char"/>
+    <w:link w:val="Header"/>
     <w:uiPriority w:val="99"/>
     <w:rsid w:val="002F34CC"/>
     <w:rPr>
@@ -3048,11 +2726,11 @@
       <w:szCs w:val="19"/>
     </w:rPr>
   </w:style>
-  <w:style w:type="paragraph" w:styleId="Titel">
+  <w:style w:type="paragraph" w:styleId="Title">
     <w:name w:val="Title"/>
-    <w:basedOn w:val="Standard"/>
-    <w:next w:val="Standard"/>
-    <w:link w:val="TitelZchn"/>
+    <w:basedOn w:val="Normal"/>
+    <w:next w:val="Normal"/>
+    <w:link w:val="TitleChar"/>
     <w:uiPriority w:val="10"/>
     <w:qFormat/>
     <w:rsid w:val="00AF3658"/>
@@ -3070,9 +2748,9 @@
       <w:szCs w:val="32"/>
     </w:rPr>
   </w:style>
-  <w:style w:type="character" w:customStyle="1" w:styleId="TitelZchn">
-    <w:name w:val="Titel Zchn"/>
-    <w:link w:val="Titel"/>
+  <w:style w:type="character" w:customStyle="1" w:styleId="TitleChar">
+    <w:name w:val="Title Char"/>
+    <w:link w:val="Title"/>
     <w:uiPriority w:val="10"/>
     <w:rsid w:val="00AF3658"/>
     <w:rPr>
@@ -3377,15 +3055,6 @@
 </file>
 
 <file path=customXml/item1.xml><?xml version="1.0" encoding="utf-8"?>
-<?mso-contentType ?>
-<FormTemplates xmlns="http://schemas.microsoft.com/sharepoint/v3/contenttype/forms">
-  <Display>DocumentLibraryForm</Display>
-  <Edit>DocumentLibraryForm</Edit>
-  <New>DocumentLibraryForm</New>
-</FormTemplates>
-</file>
-
-<file path=customXml/item2.xml><?xml version="1.0" encoding="utf-8"?>
 <ct:contentTypeSchema xmlns:ct="http://schemas.microsoft.com/office/2006/metadata/contentType" xmlns:ma="http://schemas.microsoft.com/office/2006/metadata/properties/metaAttributes" ct:_="" ma:_="" ma:contentTypeName="Dokument" ma:contentTypeID="0x0101002EEBC6866F7CDE44887A0A65BDD19E92" ma:contentTypeVersion="0" ma:contentTypeDescription="Ein neues Dokument erstellen." ma:contentTypeScope="" ma:versionID="38560b5cd9655d42543238712a2eb5fc">
   <xsd:schema xmlns:xsd="http://www.w3.org/2001/XMLSchema" xmlns:xs="http://www.w3.org/2001/XMLSchema" xmlns:p="http://schemas.microsoft.com/office/2006/metadata/properties" targetNamespace="http://schemas.microsoft.com/office/2006/metadata/properties" ma:root="true" ma:fieldsID="b4f5dc90cf06628c3b90945c8266c24d">
     <xsd:element name="properties">
@@ -3499,21 +3168,22 @@
 </ct:contentTypeSchema>
 </file>
 
-<file path=customXml/item3.xml><?xml version="1.0" encoding="utf-8"?>
+<file path=customXml/item2.xml><?xml version="1.0" encoding="utf-8"?>
 <p:properties xmlns:p="http://schemas.microsoft.com/office/2006/metadata/properties" xmlns:xsi="http://www.w3.org/2001/XMLSchema-instance" xmlns:pc="http://schemas.microsoft.com/office/infopath/2007/PartnerControls">
   <documentManagement/>
 </p:properties>
 </file>
 
-<file path=customXml/itemProps1.xml><?xml version="1.0" encoding="utf-8"?>
-<ds:datastoreItem xmlns:ds="http://schemas.openxmlformats.org/officeDocument/2006/customXml" ds:itemID="{AA76CB6B-9E9F-43E9-B425-FBF90AD61F58}">
-  <ds:schemaRefs>
-    <ds:schemaRef ds:uri="http://schemas.microsoft.com/sharepoint/v3/contenttype/forms"/>
-  </ds:schemaRefs>
-</ds:datastoreItem>
+<file path=customXml/item3.xml><?xml version="1.0" encoding="utf-8"?>
+<?mso-contentType ?>
+<FormTemplates xmlns="http://schemas.microsoft.com/sharepoint/v3/contenttype/forms">
+  <Display>DocumentLibraryForm</Display>
+  <Edit>DocumentLibraryForm</Edit>
+  <New>DocumentLibraryForm</New>
+</FormTemplates>
 </file>
 
-<file path=customXml/itemProps2.xml><?xml version="1.0" encoding="utf-8"?>
+<file path=customXml/itemProps1.xml><?xml version="1.0" encoding="utf-8"?>
 <ds:datastoreItem xmlns:ds="http://schemas.openxmlformats.org/officeDocument/2006/customXml" ds:itemID="{A70FA4D4-F3B9-4B43-A5E0-223E11252C2C}">
   <ds:schemaRefs>
     <ds:schemaRef ds:uri="http://schemas.microsoft.com/office/2006/metadata/contentType"/>
@@ -3529,11 +3199,19 @@
 </ds:datastoreItem>
 </file>
 
-<file path=customXml/itemProps3.xml><?xml version="1.0" encoding="utf-8"?>
+<file path=customXml/itemProps2.xml><?xml version="1.0" encoding="utf-8"?>
 <ds:datastoreItem xmlns:ds="http://schemas.openxmlformats.org/officeDocument/2006/customXml" ds:itemID="{C5E2A4AB-694B-4164-BD6D-DE142B47F176}">
   <ds:schemaRefs>
     <ds:schemaRef ds:uri="http://schemas.microsoft.com/office/2006/metadata/properties"/>
     <ds:schemaRef ds:uri="http://schemas.microsoft.com/office/infopath/2007/PartnerControls"/>
   </ds:schemaRefs>
 </ds:datastoreItem>
+</file>
+
+<file path=customXml/itemProps3.xml><?xml version="1.0" encoding="utf-8"?>
+<ds:datastoreItem xmlns:ds="http://schemas.openxmlformats.org/officeDocument/2006/customXml" ds:itemID="{AA76CB6B-9E9F-43E9-B425-FBF90AD61F58}">
+  <ds:schemaRefs>
+    <ds:schemaRef ds:uri="http://schemas.microsoft.com/sharepoint/v3/contenttype/forms"/>
+  </ds:schemaRefs>
+</ds:datastoreItem>
 </file>
</xml_diff>